<commit_message>
feat: 202300512: Add Players Data
</commit_message>
<xml_diff>
--- a/Fase1/docs/report/Documentacion_G19.docx
+++ b/Fase1/docs/report/Documentacion_G19.docx
@@ -1190,20 +1190,8 @@
     </w:p>
     <w:p>
       <w:pPr>
-        <w:pStyle w:val="Descripcin"/>
-        <w:jc w:val="center"/>
-      </w:pPr>
-      <w:r>
-        <w:t xml:space="preserve">Ilustración </w:t>
-      </w:r>
-      <w:fldSimple w:instr=" SEQ Ilustración \* ARABIC ">
-        <w:r>
-          <w:rPr>
-            <w:noProof/>
-          </w:rPr>
-          <w:t>1</w:t>
-        </w:r>
-      </w:fldSimple>
+        <w:keepNext/>
+      </w:pPr>
     </w:p>
     <w:p>
       <w:pPr>
@@ -1230,25 +1218,206 @@
         <w:rPr>
           <w:lang w:val="es-GT"/>
         </w:rPr>
-        <w:t>Semana del 09 – 13 de Marzo</w:t>
-      </w:r>
-    </w:p>
-    <w:p>
-      <w:pPr>
+        <w:t xml:space="preserve">Semana del 09 – 13 de </w:t>
+      </w:r>
+      <w:proofErr w:type="gramStart"/>
+      <w:r>
         <w:rPr>
           <w:lang w:val="es-GT"/>
         </w:rPr>
-      </w:pPr>
-      <w:r>
+        <w:t>Marzo</w:t>
+      </w:r>
+      <w:proofErr w:type="gramEnd"/>
+    </w:p>
+    <w:p>
+      <w:pPr>
         <w:rPr>
           <w:lang w:val="es-GT"/>
         </w:rPr>
+      </w:pPr>
+      <w:r>
+        <w:rPr>
+          <w:lang w:val="es-GT"/>
+        </w:rPr>
         <w:t>Durante esta semana el equipo comenzó a usar la técnica de “webscrapping” para capturar la información</w:t>
       </w:r>
+      <w:r>
+        <w:rPr>
+          <w:lang w:val="es-GT"/>
+        </w:rPr>
+        <w:t>.</w:t>
+      </w:r>
+    </w:p>
+    <w:p>
+      <w:pPr>
+        <w:rPr>
+          <w:lang w:val="es-GT"/>
+        </w:rPr>
+      </w:pPr>
+      <w:r>
+        <w:rPr>
+          <w:lang w:val="es-GT"/>
+        </w:rPr>
+        <w:t xml:space="preserve">El equipo ha tenido distintas formas para extraer la información de la página, sin </w:t>
+      </w:r>
+      <w:proofErr w:type="gramStart"/>
+      <w:r>
+        <w:rPr>
+          <w:lang w:val="es-GT"/>
+        </w:rPr>
+        <w:t>embargo</w:t>
+      </w:r>
+      <w:proofErr w:type="gramEnd"/>
+      <w:r>
+        <w:rPr>
+          <w:lang w:val="es-GT"/>
+        </w:rPr>
+        <w:t xml:space="preserve"> hemos encontrado una dificultad, la página restringe los accesos de búsqueda de la información.</w:t>
+      </w:r>
+      <w:r>
+        <w:rPr>
+          <w:lang w:val="es-GT"/>
+        </w:rPr>
+        <w:br/>
+      </w:r>
+      <w:r>
+        <w:rPr>
+          <w:lang w:val="es-GT"/>
+        </w:rPr>
+        <w:lastRenderedPageBreak/>
+        <w:br/>
+      </w:r>
+      <w:r>
+        <w:rPr>
+          <w:lang w:val="es-GT"/>
+        </w:rPr>
+        <w:drawing>
+          <wp:inline distT="0" distB="0" distL="0" distR="0" wp14:anchorId="15D6DCC7" wp14:editId="296CB8FB">
+            <wp:extent cx="5731510" cy="1769745"/>
+            <wp:effectExtent l="0" t="0" r="2540" b="1905"/>
+            <wp:docPr id="1893851293" name="Imagen 1"/>
+            <wp:cNvGraphicFramePr>
+              <a:graphicFrameLocks xmlns:a="http://schemas.openxmlformats.org/drawingml/2006/main" noChangeAspect="1"/>
+            </wp:cNvGraphicFramePr>
+            <a:graphic xmlns:a="http://schemas.openxmlformats.org/drawingml/2006/main">
+              <a:graphicData uri="http://schemas.openxmlformats.org/drawingml/2006/picture">
+                <pic:pic xmlns:pic="http://schemas.openxmlformats.org/drawingml/2006/picture">
+                  <pic:nvPicPr>
+                    <pic:cNvPr id="1893851293" name=""/>
+                    <pic:cNvPicPr/>
+                  </pic:nvPicPr>
+                  <pic:blipFill>
+                    <a:blip r:embed="rId10"/>
+                    <a:stretch>
+                      <a:fillRect/>
+                    </a:stretch>
+                  </pic:blipFill>
+                  <pic:spPr>
+                    <a:xfrm>
+                      <a:off x="0" y="0"/>
+                      <a:ext cx="5731510" cy="1769745"/>
+                    </a:xfrm>
+                    <a:prstGeom prst="rect">
+                      <a:avLst/>
+                    </a:prstGeom>
+                  </pic:spPr>
+                </pic:pic>
+              </a:graphicData>
+            </a:graphic>
+          </wp:inline>
+        </w:drawing>
+      </w:r>
+    </w:p>
+    <w:p>
+      <w:pPr>
+        <w:rPr>
+          <w:lang w:val="es-GT"/>
+        </w:rPr>
+      </w:pPr>
+    </w:p>
+    <w:p>
+      <w:pPr>
+        <w:rPr>
+          <w:lang w:val="es-GT"/>
+        </w:rPr>
+      </w:pPr>
+      <w:r>
+        <w:rPr>
+          <w:lang w:val="es-GT"/>
+        </w:rPr>
+        <w:t>Por lo que se tomó la decisión de intentar obtener los archivos html correspondientes a cada bloque de información.</w:t>
+      </w:r>
+      <w:r>
+        <w:rPr>
+          <w:lang w:val="es-GT"/>
+        </w:rPr>
+        <w:br/>
+      </w:r>
+      <w:r>
+        <w:rPr>
+          <w:lang w:val="es-GT"/>
+        </w:rPr>
+        <w:br/>
+        <w:t>Uno de los primeros bloques de información a utilizar es sobre los jugadores, para esto se usó Selenium junto a un scrip de Python para obtener toda la información de los jugadores.</w:t>
+      </w:r>
+    </w:p>
+    <w:p>
+      <w:pPr>
+        <w:rPr>
+          <w:lang w:val="es-GT"/>
+        </w:rPr>
+      </w:pPr>
+    </w:p>
+    <w:p>
+      <w:pPr>
+        <w:rPr>
+          <w:lang w:val="es-GT"/>
+        </w:rPr>
+      </w:pPr>
+      <w:r>
+        <w:rPr>
+          <w:lang w:val="es-GT"/>
+        </w:rPr>
+        <w:drawing>
+          <wp:inline distT="0" distB="0" distL="0" distR="0" wp14:anchorId="7FF2923B" wp14:editId="12E9E6E3">
+            <wp:extent cx="5731510" cy="2561590"/>
+            <wp:effectExtent l="0" t="0" r="2540" b="0"/>
+            <wp:docPr id="749285036" name="Imagen 1"/>
+            <wp:cNvGraphicFramePr>
+              <a:graphicFrameLocks xmlns:a="http://schemas.openxmlformats.org/drawingml/2006/main" noChangeAspect="1"/>
+            </wp:cNvGraphicFramePr>
+            <a:graphic xmlns:a="http://schemas.openxmlformats.org/drawingml/2006/main">
+              <a:graphicData uri="http://schemas.openxmlformats.org/drawingml/2006/picture">
+                <pic:pic xmlns:pic="http://schemas.openxmlformats.org/drawingml/2006/picture">
+                  <pic:nvPicPr>
+                    <pic:cNvPr id="749285036" name=""/>
+                    <pic:cNvPicPr/>
+                  </pic:nvPicPr>
+                  <pic:blipFill>
+                    <a:blip r:embed="rId11"/>
+                    <a:stretch>
+                      <a:fillRect/>
+                    </a:stretch>
+                  </pic:blipFill>
+                  <pic:spPr>
+                    <a:xfrm>
+                      <a:off x="0" y="0"/>
+                      <a:ext cx="5731510" cy="2561590"/>
+                    </a:xfrm>
+                    <a:prstGeom prst="rect">
+                      <a:avLst/>
+                    </a:prstGeom>
+                  </pic:spPr>
+                </pic:pic>
+              </a:graphicData>
+            </a:graphic>
+          </wp:inline>
+        </w:drawing>
+      </w:r>
     </w:p>
     <w:sectPr>
-      <w:footerReference w:type="default" r:id="rId10"/>
-      <w:footerReference w:type="first" r:id="rId11"/>
+      <w:footerReference w:type="default" r:id="rId12"/>
+      <w:footerReference w:type="first" r:id="rId13"/>
       <w:pgSz w:w="11906" w:h="16838"/>
       <w:pgMar w:top="1440" w:right="1440" w:bottom="1440" w:left="1440" w:header="720" w:footer="720" w:gutter="0"/>
       <w:pgNumType w:start="0"/>

</xml_diff>